<commit_message>
Generate ERP reports in Markdown Word and PDF
</commit_message>
<xml_diff>
--- a/outputs/职能部门ERP系统操作分析报告.docx
+++ b/outputs/职能部门ERP系统操作分析报告.docx
@@ -21,7 +21,7 @@
           <w:color w:val="44546A"/>
           <w:sz w:val="20"/>
         </w:rPr>
-        <w:t>基于《ERP使用情况-近一年.xlsx》中“职能部门人员ERP操作”与“职能部门人员台账”数据</w:t>
+        <w:t>基于《ERP使用情况-01.xlsx》中“职能部门人员ERP操作”与“职能部门人员台账”数据</w:t>
       </w:r>
     </w:p>
     <w:tbl>
@@ -5168,6 +5168,14 @@
         <w:t>五、评论与驳回情况</w:t>
       </w:r>
     </w:p>
+    <w:p>
+      <w:pPr>
+        <w:pStyle w:val="Heading2"/>
+      </w:pPr>
+      <w:r>
+        <w:t>驳回次数前十</w:t>
+      </w:r>
+    </w:p>
     <w:tbl>
       <w:tblPr>
         <w:tblStyle w:val="TableGrid"/>
@@ -6155,6 +6163,14 @@
     <w:p>
       <w:r>
         <w:t>驳回次数靠前人员集中在合同管理部、资产财务部、物资部、项目管理公司和公司领导层，说明这些岗位对流程合规性、资料完整性或业务条件的校验较多。评论次数靠前人员与驳回高频人员高度重合，表明有效评论很可能承担了补充说明、修改指引和审批意见留痕作用。</w:t>
+      </w:r>
+    </w:p>
+    <w:p>
+      <w:pPr>
+        <w:pStyle w:val="Heading2"/>
+      </w:pPr>
+      <w:r>
+        <w:t>有效评论前十</w:t>
       </w:r>
     </w:p>
     <w:tbl>
@@ -9239,7 +9255,7 @@
     </w:p>
     <w:p>
       <w:r>
-        <w:t>数据来源：ERP使用情况-近一年.xlsx；统计口径：以“职能部门人员ERP操作”按部门、人员、参与类型汇总，并与“职能部门人员台账”按部门+姓名匹配。</w:t>
+        <w:t>数据来源：ERP使用情况-01.xlsx；统计口径：以“职能部门人员ERP操作”按部门、人员、参与类型汇总，并与“职能部门人员台账”按姓名匹配；姓名可匹配但部门口径不同的人员，按台账部门纳入部门覆盖统计。</w:t>
       </w:r>
     </w:p>
     <w:sectPr>

</xml_diff>